<commit_message>
Embed real portal screenshots into the Portal Guide
Adds the live screenshots into their matching page sections (real
chart labels/legends, not sample data) so the guide reflects the
actual portal instead of illustrative mockups. screenshots/ holds the
source images; screenshot_dims.json keeps each one's display size in
sync with its real aspect ratio.
</commit_message>
<xml_diff>
--- a/docs/user-guide/Portal_Guide.docx
+++ b/docs/user-guide/Portal_Guide.docx
@@ -496,6 +496,68 @@
     </w:p>
     <w:p>
       <w:pPr>
+        <w:spacing w:after="30" w:before="60"/>
+        <w:jc w:val="center"/>
+      </w:pPr>
+      <w:r>
+        <w:drawing>
+          <wp:inline distT="0" distB="0" distL="0" distR="0">
+            <wp:extent cx="5905500" cy="13125450"/>
+            <wp:effectExtent t="0" r="0" b="0" l="0"/>
+            <wp:docPr id="1" name="" descr="" title=""/>
+            <wp:cNvGraphicFramePr>
+              <a:graphicFrameLocks xmlns:a="http://schemas.openxmlformats.org/drawingml/2006/main" noChangeAspect="1"/>
+            </wp:cNvGraphicFramePr>
+            <a:graphic xmlns:a="http://schemas.openxmlformats.org/drawingml/2006/main">
+              <a:graphicData uri="http://schemas.openxmlformats.org/drawingml/2006/picture">
+                <pic:pic xmlns:pic="http://schemas.openxmlformats.org/drawingml/2006/picture">
+                  <pic:nvPicPr>
+                    <pic:cNvPr id="0" name="" descr=""/>
+                    <pic:cNvPicPr>
+                      <a:picLocks noChangeAspect="1" noChangeArrowheads="1"/>
+                    </pic:cNvPicPr>
+                  </pic:nvPicPr>
+                  <pic:blipFill>
+                    <a:blip r:embed="rId10" cstate="none"/>
+                    <a:srcRect/>
+                    <a:stretch>
+                      <a:fillRect/>
+                    </a:stretch>
+                  </pic:blipFill>
+                  <pic:spPr bwMode="auto">
+                    <a:xfrm>
+                      <a:off x="0" y="0"/>
+                      <a:ext cx="5905500" cy="13125450"/>
+                    </a:xfrm>
+                    <a:prstGeom prst="rect">
+                      <a:avLst/>
+                    </a:prstGeom>
+                  </pic:spPr>
+                </pic:pic>
+              </a:graphicData>
+            </a:graphic>
+          </wp:inline>
+        </w:drawing>
+      </w:r>
+    </w:p>
+    <w:p>
+      <w:pPr>
+        <w:spacing w:after="160"/>
+        <w:jc w:val="center"/>
+      </w:pPr>
+      <w:r>
+        <w:rPr>
+          <w:i/>
+          <w:iCs/>
+          <w:color w:val="6B6878"/>
+          <w:sz w:val="14"/>
+          <w:szCs w:val="14"/>
+        </w:rPr>
+        <w:t xml:space="preserve">Live portal screenshot</w:t>
+      </w:r>
+    </w:p>
+    <w:p>
+      <w:pPr>
         <w:pBdr>
           <w:bottom w:val="single" w:color="FFC72C" w:sz="8" w:space="2"/>
         </w:pBdr>
@@ -769,6 +831,68 @@
     </w:p>
     <w:p>
       <w:pPr>
+        <w:spacing w:after="30" w:before="60"/>
+        <w:jc w:val="center"/>
+      </w:pPr>
+      <w:r>
+        <w:drawing>
+          <wp:inline distT="0" distB="0" distL="0" distR="0">
+            <wp:extent cx="5905500" cy="13125450"/>
+            <wp:effectExtent t="0" r="0" b="0" l="0"/>
+            <wp:docPr id="1" name="" descr="" title=""/>
+            <wp:cNvGraphicFramePr>
+              <a:graphicFrameLocks xmlns:a="http://schemas.openxmlformats.org/drawingml/2006/main" noChangeAspect="1"/>
+            </wp:cNvGraphicFramePr>
+            <a:graphic xmlns:a="http://schemas.openxmlformats.org/drawingml/2006/main">
+              <a:graphicData uri="http://schemas.openxmlformats.org/drawingml/2006/picture">
+                <pic:pic xmlns:pic="http://schemas.openxmlformats.org/drawingml/2006/picture">
+                  <pic:nvPicPr>
+                    <pic:cNvPr id="0" name="" descr=""/>
+                    <pic:cNvPicPr>
+                      <a:picLocks noChangeAspect="1" noChangeArrowheads="1"/>
+                    </pic:cNvPicPr>
+                  </pic:nvPicPr>
+                  <pic:blipFill>
+                    <a:blip r:embed="rId11" cstate="none"/>
+                    <a:srcRect/>
+                    <a:stretch>
+                      <a:fillRect/>
+                    </a:stretch>
+                  </pic:blipFill>
+                  <pic:spPr bwMode="auto">
+                    <a:xfrm>
+                      <a:off x="0" y="0"/>
+                      <a:ext cx="5905500" cy="13125450"/>
+                    </a:xfrm>
+                    <a:prstGeom prst="rect">
+                      <a:avLst/>
+                    </a:prstGeom>
+                  </pic:spPr>
+                </pic:pic>
+              </a:graphicData>
+            </a:graphic>
+          </wp:inline>
+        </w:drawing>
+      </w:r>
+    </w:p>
+    <w:p>
+      <w:pPr>
+        <w:spacing w:after="160"/>
+        <w:jc w:val="center"/>
+      </w:pPr>
+      <w:r>
+        <w:rPr>
+          <w:i/>
+          <w:iCs/>
+          <w:color w:val="6B6878"/>
+          <w:sz w:val="14"/>
+          <w:szCs w:val="14"/>
+        </w:rPr>
+        <w:t xml:space="preserve">Live portal screenshot</w:t>
+      </w:r>
+    </w:p>
+    <w:p>
+      <w:pPr>
         <w:pBdr>
           <w:bottom w:val="single" w:color="FFC72C" w:sz="8" w:space="2"/>
         </w:pBdr>
@@ -1076,6 +1200,68 @@
     </w:p>
     <w:p>
       <w:pPr>
+        <w:spacing w:after="30" w:before="60"/>
+        <w:jc w:val="center"/>
+      </w:pPr>
+      <w:r>
+        <w:drawing>
+          <wp:inline distT="0" distB="0" distL="0" distR="0">
+            <wp:extent cx="5905500" cy="19059525"/>
+            <wp:effectExtent t="0" r="0" b="0" l="0"/>
+            <wp:docPr id="1" name="" descr="" title=""/>
+            <wp:cNvGraphicFramePr>
+              <a:graphicFrameLocks xmlns:a="http://schemas.openxmlformats.org/drawingml/2006/main" noChangeAspect="1"/>
+            </wp:cNvGraphicFramePr>
+            <a:graphic xmlns:a="http://schemas.openxmlformats.org/drawingml/2006/main">
+              <a:graphicData uri="http://schemas.openxmlformats.org/drawingml/2006/picture">
+                <pic:pic xmlns:pic="http://schemas.openxmlformats.org/drawingml/2006/picture">
+                  <pic:nvPicPr>
+                    <pic:cNvPr id="0" name="" descr=""/>
+                    <pic:cNvPicPr>
+                      <a:picLocks noChangeAspect="1" noChangeArrowheads="1"/>
+                    </pic:cNvPicPr>
+                  </pic:nvPicPr>
+                  <pic:blipFill>
+                    <a:blip r:embed="rId12" cstate="none"/>
+                    <a:srcRect/>
+                    <a:stretch>
+                      <a:fillRect/>
+                    </a:stretch>
+                  </pic:blipFill>
+                  <pic:spPr bwMode="auto">
+                    <a:xfrm>
+                      <a:off x="0" y="0"/>
+                      <a:ext cx="5905500" cy="19059525"/>
+                    </a:xfrm>
+                    <a:prstGeom prst="rect">
+                      <a:avLst/>
+                    </a:prstGeom>
+                  </pic:spPr>
+                </pic:pic>
+              </a:graphicData>
+            </a:graphic>
+          </wp:inline>
+        </w:drawing>
+      </w:r>
+    </w:p>
+    <w:p>
+      <w:pPr>
+        <w:spacing w:after="160"/>
+        <w:jc w:val="center"/>
+      </w:pPr>
+      <w:r>
+        <w:rPr>
+          <w:i/>
+          <w:iCs/>
+          <w:color w:val="6B6878"/>
+          <w:sz w:val="14"/>
+          <w:szCs w:val="14"/>
+        </w:rPr>
+        <w:t xml:space="preserve">Live portal screenshot</w:t>
+      </w:r>
+    </w:p>
+    <w:p>
+      <w:pPr>
         <w:pBdr>
           <w:bottom w:val="single" w:color="FFC72C" w:sz="8" w:space="2"/>
         </w:pBdr>
@@ -1485,6 +1671,68 @@
     </w:p>
     <w:p>
       <w:pPr>
+        <w:spacing w:after="30" w:before="60"/>
+        <w:jc w:val="center"/>
+      </w:pPr>
+      <w:r>
+        <w:drawing>
+          <wp:inline distT="0" distB="0" distL="0" distR="0">
+            <wp:extent cx="5905500" cy="30918150"/>
+            <wp:effectExtent t="0" r="0" b="0" l="0"/>
+            <wp:docPr id="1" name="" descr="" title=""/>
+            <wp:cNvGraphicFramePr>
+              <a:graphicFrameLocks xmlns:a="http://schemas.openxmlformats.org/drawingml/2006/main" noChangeAspect="1"/>
+            </wp:cNvGraphicFramePr>
+            <a:graphic xmlns:a="http://schemas.openxmlformats.org/drawingml/2006/main">
+              <a:graphicData uri="http://schemas.openxmlformats.org/drawingml/2006/picture">
+                <pic:pic xmlns:pic="http://schemas.openxmlformats.org/drawingml/2006/picture">
+                  <pic:nvPicPr>
+                    <pic:cNvPr id="0" name="" descr=""/>
+                    <pic:cNvPicPr>
+                      <a:picLocks noChangeAspect="1" noChangeArrowheads="1"/>
+                    </pic:cNvPicPr>
+                  </pic:nvPicPr>
+                  <pic:blipFill>
+                    <a:blip r:embed="rId13" cstate="none"/>
+                    <a:srcRect/>
+                    <a:stretch>
+                      <a:fillRect/>
+                    </a:stretch>
+                  </pic:blipFill>
+                  <pic:spPr bwMode="auto">
+                    <a:xfrm>
+                      <a:off x="0" y="0"/>
+                      <a:ext cx="5905500" cy="30918150"/>
+                    </a:xfrm>
+                    <a:prstGeom prst="rect">
+                      <a:avLst/>
+                    </a:prstGeom>
+                  </pic:spPr>
+                </pic:pic>
+              </a:graphicData>
+            </a:graphic>
+          </wp:inline>
+        </w:drawing>
+      </w:r>
+    </w:p>
+    <w:p>
+      <w:pPr>
+        <w:spacing w:after="160"/>
+        <w:jc w:val="center"/>
+      </w:pPr>
+      <w:r>
+        <w:rPr>
+          <w:i/>
+          <w:iCs/>
+          <w:color w:val="6B6878"/>
+          <w:sz w:val="14"/>
+          <w:szCs w:val="14"/>
+        </w:rPr>
+        <w:t xml:space="preserve">Live portal screenshot</w:t>
+      </w:r>
+    </w:p>
+    <w:p>
+      <w:pPr>
         <w:pBdr>
           <w:bottom w:val="single" w:color="FFC72C" w:sz="8" w:space="2"/>
         </w:pBdr>
@@ -1928,6 +2176,68 @@
     </w:p>
     <w:p>
       <w:pPr>
+        <w:spacing w:after="30" w:before="60"/>
+        <w:jc w:val="center"/>
+      </w:pPr>
+      <w:r>
+        <w:drawing>
+          <wp:inline distT="0" distB="0" distL="0" distR="0">
+            <wp:extent cx="5905500" cy="27346275"/>
+            <wp:effectExtent t="0" r="0" b="0" l="0"/>
+            <wp:docPr id="1" name="" descr="" title=""/>
+            <wp:cNvGraphicFramePr>
+              <a:graphicFrameLocks xmlns:a="http://schemas.openxmlformats.org/drawingml/2006/main" noChangeAspect="1"/>
+            </wp:cNvGraphicFramePr>
+            <a:graphic xmlns:a="http://schemas.openxmlformats.org/drawingml/2006/main">
+              <a:graphicData uri="http://schemas.openxmlformats.org/drawingml/2006/picture">
+                <pic:pic xmlns:pic="http://schemas.openxmlformats.org/drawingml/2006/picture">
+                  <pic:nvPicPr>
+                    <pic:cNvPr id="0" name="" descr=""/>
+                    <pic:cNvPicPr>
+                      <a:picLocks noChangeAspect="1" noChangeArrowheads="1"/>
+                    </pic:cNvPicPr>
+                  </pic:nvPicPr>
+                  <pic:blipFill>
+                    <a:blip r:embed="rId14" cstate="none"/>
+                    <a:srcRect/>
+                    <a:stretch>
+                      <a:fillRect/>
+                    </a:stretch>
+                  </pic:blipFill>
+                  <pic:spPr bwMode="auto">
+                    <a:xfrm>
+                      <a:off x="0" y="0"/>
+                      <a:ext cx="5905500" cy="27346275"/>
+                    </a:xfrm>
+                    <a:prstGeom prst="rect">
+                      <a:avLst/>
+                    </a:prstGeom>
+                  </pic:spPr>
+                </pic:pic>
+              </a:graphicData>
+            </a:graphic>
+          </wp:inline>
+        </w:drawing>
+      </w:r>
+    </w:p>
+    <w:p>
+      <w:pPr>
+        <w:spacing w:after="160"/>
+        <w:jc w:val="center"/>
+      </w:pPr>
+      <w:r>
+        <w:rPr>
+          <w:i/>
+          <w:iCs/>
+          <w:color w:val="6B6878"/>
+          <w:sz w:val="14"/>
+          <w:szCs w:val="14"/>
+        </w:rPr>
+        <w:t xml:space="preserve">Live portal screenshot</w:t>
+      </w:r>
+    </w:p>
+    <w:p>
+      <w:pPr>
         <w:pBdr>
           <w:bottom w:val="single" w:color="FFC72C" w:sz="8" w:space="2"/>
         </w:pBdr>
@@ -2401,6 +2711,68 @@
           <w:szCs w:val="17"/>
         </w:rPr>
         <w:t xml:space="preserve">Choosing a Store filters every chart and both tables to just that store. The Year/Months filter changes which snapshot in time the risk scores are calculated for — since risk is about currently-active employees, this is normally left on the latest period.</w:t>
+      </w:r>
+    </w:p>
+    <w:p>
+      <w:pPr>
+        <w:spacing w:after="30" w:before="60"/>
+        <w:jc w:val="center"/>
+      </w:pPr>
+      <w:r>
+        <w:drawing>
+          <wp:inline distT="0" distB="0" distL="0" distR="0">
+            <wp:extent cx="5905500" cy="17392650"/>
+            <wp:effectExtent t="0" r="0" b="0" l="0"/>
+            <wp:docPr id="1" name="" descr="" title=""/>
+            <wp:cNvGraphicFramePr>
+              <a:graphicFrameLocks xmlns:a="http://schemas.openxmlformats.org/drawingml/2006/main" noChangeAspect="1"/>
+            </wp:cNvGraphicFramePr>
+            <a:graphic xmlns:a="http://schemas.openxmlformats.org/drawingml/2006/main">
+              <a:graphicData uri="http://schemas.openxmlformats.org/drawingml/2006/picture">
+                <pic:pic xmlns:pic="http://schemas.openxmlformats.org/drawingml/2006/picture">
+                  <pic:nvPicPr>
+                    <pic:cNvPr id="0" name="" descr=""/>
+                    <pic:cNvPicPr>
+                      <a:picLocks noChangeAspect="1" noChangeArrowheads="1"/>
+                    </pic:cNvPicPr>
+                  </pic:nvPicPr>
+                  <pic:blipFill>
+                    <a:blip r:embed="rId15" cstate="none"/>
+                    <a:srcRect/>
+                    <a:stretch>
+                      <a:fillRect/>
+                    </a:stretch>
+                  </pic:blipFill>
+                  <pic:spPr bwMode="auto">
+                    <a:xfrm>
+                      <a:off x="0" y="0"/>
+                      <a:ext cx="5905500" cy="17392650"/>
+                    </a:xfrm>
+                    <a:prstGeom prst="rect">
+                      <a:avLst/>
+                    </a:prstGeom>
+                  </pic:spPr>
+                </pic:pic>
+              </a:graphicData>
+            </a:graphic>
+          </wp:inline>
+        </w:drawing>
+      </w:r>
+    </w:p>
+    <w:p>
+      <w:pPr>
+        <w:spacing w:after="160"/>
+        <w:jc w:val="center"/>
+      </w:pPr>
+      <w:r>
+        <w:rPr>
+          <w:i/>
+          <w:iCs/>
+          <w:color w:val="6B6878"/>
+          <w:sz w:val="14"/>
+          <w:szCs w:val="14"/>
+        </w:rPr>
+        <w:t xml:space="preserve">Live portal screenshot</w:t>
       </w:r>
     </w:p>
     <w:p>
@@ -2802,6 +3174,68 @@
     </w:p>
     <w:p>
       <w:pPr>
+        <w:spacing w:after="30" w:before="60"/>
+        <w:jc w:val="center"/>
+      </w:pPr>
+      <w:r>
+        <w:drawing>
+          <wp:inline distT="0" distB="0" distL="0" distR="0">
+            <wp:extent cx="5905500" cy="19059525"/>
+            <wp:effectExtent t="0" r="0" b="0" l="0"/>
+            <wp:docPr id="1" name="" descr="" title=""/>
+            <wp:cNvGraphicFramePr>
+              <a:graphicFrameLocks xmlns:a="http://schemas.openxmlformats.org/drawingml/2006/main" noChangeAspect="1"/>
+            </wp:cNvGraphicFramePr>
+            <a:graphic xmlns:a="http://schemas.openxmlformats.org/drawingml/2006/main">
+              <a:graphicData uri="http://schemas.openxmlformats.org/drawingml/2006/picture">
+                <pic:pic xmlns:pic="http://schemas.openxmlformats.org/drawingml/2006/picture">
+                  <pic:nvPicPr>
+                    <pic:cNvPr id="0" name="" descr=""/>
+                    <pic:cNvPicPr>
+                      <a:picLocks noChangeAspect="1" noChangeArrowheads="1"/>
+                    </pic:cNvPicPr>
+                  </pic:nvPicPr>
+                  <pic:blipFill>
+                    <a:blip r:embed="rId16" cstate="none"/>
+                    <a:srcRect/>
+                    <a:stretch>
+                      <a:fillRect/>
+                    </a:stretch>
+                  </pic:blipFill>
+                  <pic:spPr bwMode="auto">
+                    <a:xfrm>
+                      <a:off x="0" y="0"/>
+                      <a:ext cx="5905500" cy="19059525"/>
+                    </a:xfrm>
+                    <a:prstGeom prst="rect">
+                      <a:avLst/>
+                    </a:prstGeom>
+                  </pic:spPr>
+                </pic:pic>
+              </a:graphicData>
+            </a:graphic>
+          </wp:inline>
+        </w:drawing>
+      </w:r>
+    </w:p>
+    <w:p>
+      <w:pPr>
+        <w:spacing w:after="160"/>
+        <w:jc w:val="center"/>
+      </w:pPr>
+      <w:r>
+        <w:rPr>
+          <w:i/>
+          <w:iCs/>
+          <w:color w:val="6B6878"/>
+          <w:sz w:val="14"/>
+          <w:szCs w:val="14"/>
+        </w:rPr>
+        <w:t xml:space="preserve">Live portal screenshot</w:t>
+      </w:r>
+    </w:p>
+    <w:p>
+      <w:pPr>
         <w:pBdr>
           <w:bottom w:val="single" w:color="FFC72C" w:sz="8" w:space="2"/>
         </w:pBdr>
@@ -3313,6 +3747,68 @@
     </w:p>
     <w:p>
       <w:pPr>
+        <w:spacing w:after="30" w:before="60"/>
+        <w:jc w:val="center"/>
+      </w:pPr>
+      <w:r>
+        <w:drawing>
+          <wp:inline distT="0" distB="0" distL="0" distR="0">
+            <wp:extent cx="5905500" cy="21707475"/>
+            <wp:effectExtent t="0" r="0" b="0" l="0"/>
+            <wp:docPr id="1" name="" descr="" title=""/>
+            <wp:cNvGraphicFramePr>
+              <a:graphicFrameLocks xmlns:a="http://schemas.openxmlformats.org/drawingml/2006/main" noChangeAspect="1"/>
+            </wp:cNvGraphicFramePr>
+            <a:graphic xmlns:a="http://schemas.openxmlformats.org/drawingml/2006/main">
+              <a:graphicData uri="http://schemas.openxmlformats.org/drawingml/2006/picture">
+                <pic:pic xmlns:pic="http://schemas.openxmlformats.org/drawingml/2006/picture">
+                  <pic:nvPicPr>
+                    <pic:cNvPr id="0" name="" descr=""/>
+                    <pic:cNvPicPr>
+                      <a:picLocks noChangeAspect="1" noChangeArrowheads="1"/>
+                    </pic:cNvPicPr>
+                  </pic:nvPicPr>
+                  <pic:blipFill>
+                    <a:blip r:embed="rId17" cstate="none"/>
+                    <a:srcRect/>
+                    <a:stretch>
+                      <a:fillRect/>
+                    </a:stretch>
+                  </pic:blipFill>
+                  <pic:spPr bwMode="auto">
+                    <a:xfrm>
+                      <a:off x="0" y="0"/>
+                      <a:ext cx="5905500" cy="21707475"/>
+                    </a:xfrm>
+                    <a:prstGeom prst="rect">
+                      <a:avLst/>
+                    </a:prstGeom>
+                  </pic:spPr>
+                </pic:pic>
+              </a:graphicData>
+            </a:graphic>
+          </wp:inline>
+        </w:drawing>
+      </w:r>
+    </w:p>
+    <w:p>
+      <w:pPr>
+        <w:spacing w:after="160"/>
+        <w:jc w:val="center"/>
+      </w:pPr>
+      <w:r>
+        <w:rPr>
+          <w:i/>
+          <w:iCs/>
+          <w:color w:val="6B6878"/>
+          <w:sz w:val="14"/>
+          <w:szCs w:val="14"/>
+        </w:rPr>
+        <w:t xml:space="preserve">Live portal screenshot</w:t>
+      </w:r>
+    </w:p>
+    <w:p>
+      <w:pPr>
         <w:pBdr>
           <w:bottom w:val="single" w:color="FFC72C" w:sz="8" w:space="2"/>
         </w:pBdr>
@@ -3688,6 +4184,68 @@
     </w:p>
     <w:p>
       <w:pPr>
+        <w:spacing w:after="30" w:before="60"/>
+        <w:jc w:val="center"/>
+      </w:pPr>
+      <w:r>
+        <w:drawing>
+          <wp:inline distT="0" distB="0" distL="0" distR="0">
+            <wp:extent cx="5905500" cy="13125450"/>
+            <wp:effectExtent t="0" r="0" b="0" l="0"/>
+            <wp:docPr id="1" name="" descr="" title=""/>
+            <wp:cNvGraphicFramePr>
+              <a:graphicFrameLocks xmlns:a="http://schemas.openxmlformats.org/drawingml/2006/main" noChangeAspect="1"/>
+            </wp:cNvGraphicFramePr>
+            <a:graphic xmlns:a="http://schemas.openxmlformats.org/drawingml/2006/main">
+              <a:graphicData uri="http://schemas.openxmlformats.org/drawingml/2006/picture">
+                <pic:pic xmlns:pic="http://schemas.openxmlformats.org/drawingml/2006/picture">
+                  <pic:nvPicPr>
+                    <pic:cNvPr id="0" name="" descr=""/>
+                    <pic:cNvPicPr>
+                      <a:picLocks noChangeAspect="1" noChangeArrowheads="1"/>
+                    </pic:cNvPicPr>
+                  </pic:nvPicPr>
+                  <pic:blipFill>
+                    <a:blip r:embed="rId18" cstate="none"/>
+                    <a:srcRect/>
+                    <a:stretch>
+                      <a:fillRect/>
+                    </a:stretch>
+                  </pic:blipFill>
+                  <pic:spPr bwMode="auto">
+                    <a:xfrm>
+                      <a:off x="0" y="0"/>
+                      <a:ext cx="5905500" cy="13125450"/>
+                    </a:xfrm>
+                    <a:prstGeom prst="rect">
+                      <a:avLst/>
+                    </a:prstGeom>
+                  </pic:spPr>
+                </pic:pic>
+              </a:graphicData>
+            </a:graphic>
+          </wp:inline>
+        </w:drawing>
+      </w:r>
+    </w:p>
+    <w:p>
+      <w:pPr>
+        <w:spacing w:after="160"/>
+        <w:jc w:val="center"/>
+      </w:pPr>
+      <w:r>
+        <w:rPr>
+          <w:i/>
+          <w:iCs/>
+          <w:color w:val="6B6878"/>
+          <w:sz w:val="14"/>
+          <w:szCs w:val="14"/>
+        </w:rPr>
+        <w:t xml:space="preserve">Live portal screenshot</w:t>
+      </w:r>
+    </w:p>
+    <w:p>
+      <w:pPr>
         <w:pBdr>
           <w:bottom w:val="single" w:color="FFC72C" w:sz="8" w:space="2"/>
         </w:pBdr>
@@ -3859,6 +4417,68 @@
     </w:p>
     <w:p>
       <w:pPr>
+        <w:spacing w:after="30" w:before="60"/>
+        <w:jc w:val="center"/>
+      </w:pPr>
+      <w:r>
+        <w:drawing>
+          <wp:inline distT="0" distB="0" distL="0" distR="0">
+            <wp:extent cx="5905500" cy="13125450"/>
+            <wp:effectExtent t="0" r="0" b="0" l="0"/>
+            <wp:docPr id="1" name="" descr="" title=""/>
+            <wp:cNvGraphicFramePr>
+              <a:graphicFrameLocks xmlns:a="http://schemas.openxmlformats.org/drawingml/2006/main" noChangeAspect="1"/>
+            </wp:cNvGraphicFramePr>
+            <a:graphic xmlns:a="http://schemas.openxmlformats.org/drawingml/2006/main">
+              <a:graphicData uri="http://schemas.openxmlformats.org/drawingml/2006/picture">
+                <pic:pic xmlns:pic="http://schemas.openxmlformats.org/drawingml/2006/picture">
+                  <pic:nvPicPr>
+                    <pic:cNvPr id="0" name="" descr=""/>
+                    <pic:cNvPicPr>
+                      <a:picLocks noChangeAspect="1" noChangeArrowheads="1"/>
+                    </pic:cNvPicPr>
+                  </pic:nvPicPr>
+                  <pic:blipFill>
+                    <a:blip r:embed="rId19" cstate="none"/>
+                    <a:srcRect/>
+                    <a:stretch>
+                      <a:fillRect/>
+                    </a:stretch>
+                  </pic:blipFill>
+                  <pic:spPr bwMode="auto">
+                    <a:xfrm>
+                      <a:off x="0" y="0"/>
+                      <a:ext cx="5905500" cy="13125450"/>
+                    </a:xfrm>
+                    <a:prstGeom prst="rect">
+                      <a:avLst/>
+                    </a:prstGeom>
+                  </pic:spPr>
+                </pic:pic>
+              </a:graphicData>
+            </a:graphic>
+          </wp:inline>
+        </w:drawing>
+      </w:r>
+    </w:p>
+    <w:p>
+      <w:pPr>
+        <w:spacing w:after="160"/>
+        <w:jc w:val="center"/>
+      </w:pPr>
+      <w:r>
+        <w:rPr>
+          <w:i/>
+          <w:iCs/>
+          <w:color w:val="6B6878"/>
+          <w:sz w:val="14"/>
+          <w:szCs w:val="14"/>
+        </w:rPr>
+        <w:t xml:space="preserve">Live portal screenshot</w:t>
+      </w:r>
+    </w:p>
+    <w:p>
+      <w:pPr>
         <w:pBdr>
           <w:bottom w:val="single" w:color="FFC72C" w:sz="8" w:space="2"/>
         </w:pBdr>
@@ -3977,6 +4597,68 @@
           <w:szCs w:val="19"/>
         </w:rPr>
         <w:t xml:space="preserve">This page is a catalog of every downloadable Excel report, grouped by section (Turnover, Retention, Exit Interviews, etc.). Click any card to open that report's own page, where you pick a period and filters before downloading. This index page itself has no filters — it's just a directory.</w:t>
+      </w:r>
+    </w:p>
+    <w:p>
+      <w:pPr>
+        <w:spacing w:after="30" w:before="60"/>
+        <w:jc w:val="center"/>
+      </w:pPr>
+      <w:r>
+        <w:drawing>
+          <wp:inline distT="0" distB="0" distL="0" distR="0">
+            <wp:extent cx="5905500" cy="13125450"/>
+            <wp:effectExtent t="0" r="0" b="0" l="0"/>
+            <wp:docPr id="1" name="" descr="" title=""/>
+            <wp:cNvGraphicFramePr>
+              <a:graphicFrameLocks xmlns:a="http://schemas.openxmlformats.org/drawingml/2006/main" noChangeAspect="1"/>
+            </wp:cNvGraphicFramePr>
+            <a:graphic xmlns:a="http://schemas.openxmlformats.org/drawingml/2006/main">
+              <a:graphicData uri="http://schemas.openxmlformats.org/drawingml/2006/picture">
+                <pic:pic xmlns:pic="http://schemas.openxmlformats.org/drawingml/2006/picture">
+                  <pic:nvPicPr>
+                    <pic:cNvPr id="0" name="" descr=""/>
+                    <pic:cNvPicPr>
+                      <a:picLocks noChangeAspect="1" noChangeArrowheads="1"/>
+                    </pic:cNvPicPr>
+                  </pic:nvPicPr>
+                  <pic:blipFill>
+                    <a:blip r:embed="rId20" cstate="none"/>
+                    <a:srcRect/>
+                    <a:stretch>
+                      <a:fillRect/>
+                    </a:stretch>
+                  </pic:blipFill>
+                  <pic:spPr bwMode="auto">
+                    <a:xfrm>
+                      <a:off x="0" y="0"/>
+                      <a:ext cx="5905500" cy="13125450"/>
+                    </a:xfrm>
+                    <a:prstGeom prst="rect">
+                      <a:avLst/>
+                    </a:prstGeom>
+                  </pic:spPr>
+                </pic:pic>
+              </a:graphicData>
+            </a:graphic>
+          </wp:inline>
+        </w:drawing>
+      </w:r>
+    </w:p>
+    <w:p>
+      <w:pPr>
+        <w:spacing w:after="160"/>
+        <w:jc w:val="center"/>
+      </w:pPr>
+      <w:r>
+        <w:rPr>
+          <w:i/>
+          <w:iCs/>
+          <w:color w:val="6B6878"/>
+          <w:sz w:val="14"/>
+          <w:szCs w:val="14"/>
+        </w:rPr>
+        <w:t xml:space="preserve">Live portal screenshot</w:t>
       </w:r>
     </w:p>
     <w:p>

</xml_diff>

<commit_message>
Replace raw portal screenshots with drawn sample charts (real labels)
The screenshots were meant only as a source for correct category
labels, not to be pasted into the guide directly. Draws one sample
chart per page instead, using the exact job title/payroll/gender/exit-
reason/risk-factor labels read off those screenshots, with
illustrative (non-real) values, matching the same treatment already
used for the Workforce sample.
</commit_message>
<xml_diff>
--- a/docs/user-guide/Portal_Guide.docx
+++ b/docs/user-guide/Portal_Guide.docx
@@ -502,7 +502,7 @@
       <w:r>
         <w:drawing>
           <wp:inline distT="0" distB="0" distL="0" distR="0">
-            <wp:extent cx="5905500" cy="13125450"/>
+            <wp:extent cx="4572000" cy="2181225"/>
             <wp:effectExtent t="0" r="0" b="0" l="0"/>
             <wp:docPr id="1" name="" descr="" title=""/>
             <wp:cNvGraphicFramePr>
@@ -527,7 +527,7 @@
                   <pic:spPr bwMode="auto">
                     <a:xfrm>
                       <a:off x="0" y="0"/>
-                      <a:ext cx="5905500" cy="13125450"/>
+                      <a:ext cx="4572000" cy="2181225"/>
                     </a:xfrm>
                     <a:prstGeom prst="rect">
                       <a:avLst/>
@@ -553,7 +553,7 @@
           <w:sz w:val="14"/>
           <w:szCs w:val="14"/>
         </w:rPr>
-        <w:t xml:space="preserve">Live portal screenshot</w:t>
+        <w:t xml:space="preserve">Illustrative sample — labels match the live portal; values do not.</w:t>
       </w:r>
     </w:p>
     <w:p>
@@ -837,7 +837,7 @@
       <w:r>
         <w:drawing>
           <wp:inline distT="0" distB="0" distL="0" distR="0">
-            <wp:extent cx="5905500" cy="13125450"/>
+            <wp:extent cx="4572000" cy="3695700"/>
             <wp:effectExtent t="0" r="0" b="0" l="0"/>
             <wp:docPr id="1" name="" descr="" title=""/>
             <wp:cNvGraphicFramePr>
@@ -862,7 +862,7 @@
                   <pic:spPr bwMode="auto">
                     <a:xfrm>
                       <a:off x="0" y="0"/>
-                      <a:ext cx="5905500" cy="13125450"/>
+                      <a:ext cx="4572000" cy="3695700"/>
                     </a:xfrm>
                     <a:prstGeom prst="rect">
                       <a:avLst/>
@@ -888,7 +888,7 @@
           <w:sz w:val="14"/>
           <w:szCs w:val="14"/>
         </w:rPr>
-        <w:t xml:space="preserve">Live portal screenshot</w:t>
+        <w:t xml:space="preserve">Illustrative sample — labels match the live portal; values do not.</w:t>
       </w:r>
     </w:p>
     <w:p>
@@ -1206,7 +1206,7 @@
       <w:r>
         <w:drawing>
           <wp:inline distT="0" distB="0" distL="0" distR="0">
-            <wp:extent cx="5905500" cy="19059525"/>
+            <wp:extent cx="4572000" cy="3438525"/>
             <wp:effectExtent t="0" r="0" b="0" l="0"/>
             <wp:docPr id="1" name="" descr="" title=""/>
             <wp:cNvGraphicFramePr>
@@ -1231,7 +1231,7 @@
                   <pic:spPr bwMode="auto">
                     <a:xfrm>
                       <a:off x="0" y="0"/>
-                      <a:ext cx="5905500" cy="19059525"/>
+                      <a:ext cx="4572000" cy="3438525"/>
                     </a:xfrm>
                     <a:prstGeom prst="rect">
                       <a:avLst/>
@@ -1257,7 +1257,7 @@
           <w:sz w:val="14"/>
           <w:szCs w:val="14"/>
         </w:rPr>
-        <w:t xml:space="preserve">Live portal screenshot</w:t>
+        <w:t xml:space="preserve">Illustrative sample — labels match the live portal; values do not.</w:t>
       </w:r>
     </w:p>
     <w:p>
@@ -1677,7 +1677,7 @@
       <w:r>
         <w:drawing>
           <wp:inline distT="0" distB="0" distL="0" distR="0">
-            <wp:extent cx="5905500" cy="30918150"/>
+            <wp:extent cx="4572000" cy="2162175"/>
             <wp:effectExtent t="0" r="0" b="0" l="0"/>
             <wp:docPr id="1" name="" descr="" title=""/>
             <wp:cNvGraphicFramePr>
@@ -1702,7 +1702,7 @@
                   <pic:spPr bwMode="auto">
                     <a:xfrm>
                       <a:off x="0" y="0"/>
-                      <a:ext cx="5905500" cy="30918150"/>
+                      <a:ext cx="4572000" cy="2162175"/>
                     </a:xfrm>
                     <a:prstGeom prst="rect">
                       <a:avLst/>
@@ -1728,7 +1728,7 @@
           <w:sz w:val="14"/>
           <w:szCs w:val="14"/>
         </w:rPr>
-        <w:t xml:space="preserve">Live portal screenshot</w:t>
+        <w:t xml:space="preserve">Illustrative sample — labels match the live portal; values do not.</w:t>
       </w:r>
     </w:p>
     <w:p>
@@ -2182,7 +2182,7 @@
       <w:r>
         <w:drawing>
           <wp:inline distT="0" distB="0" distL="0" distR="0">
-            <wp:extent cx="5905500" cy="27346275"/>
+            <wp:extent cx="4572000" cy="3438525"/>
             <wp:effectExtent t="0" r="0" b="0" l="0"/>
             <wp:docPr id="1" name="" descr="" title=""/>
             <wp:cNvGraphicFramePr>
@@ -2207,7 +2207,7 @@
                   <pic:spPr bwMode="auto">
                     <a:xfrm>
                       <a:off x="0" y="0"/>
-                      <a:ext cx="5905500" cy="27346275"/>
+                      <a:ext cx="4572000" cy="3438525"/>
                     </a:xfrm>
                     <a:prstGeom prst="rect">
                       <a:avLst/>
@@ -2233,7 +2233,7 @@
           <w:sz w:val="14"/>
           <w:szCs w:val="14"/>
         </w:rPr>
-        <w:t xml:space="preserve">Live portal screenshot</w:t>
+        <w:t xml:space="preserve">Illustrative sample — labels match the live portal; values do not.</w:t>
       </w:r>
     </w:p>
     <w:p>
@@ -2721,7 +2721,7 @@
       <w:r>
         <w:drawing>
           <wp:inline distT="0" distB="0" distL="0" distR="0">
-            <wp:extent cx="5905500" cy="17392650"/>
+            <wp:extent cx="4572000" cy="2428875"/>
             <wp:effectExtent t="0" r="0" b="0" l="0"/>
             <wp:docPr id="1" name="" descr="" title=""/>
             <wp:cNvGraphicFramePr>
@@ -2746,7 +2746,7 @@
                   <pic:spPr bwMode="auto">
                     <a:xfrm>
                       <a:off x="0" y="0"/>
-                      <a:ext cx="5905500" cy="17392650"/>
+                      <a:ext cx="4572000" cy="2428875"/>
                     </a:xfrm>
                     <a:prstGeom prst="rect">
                       <a:avLst/>
@@ -2772,7 +2772,7 @@
           <w:sz w:val="14"/>
           <w:szCs w:val="14"/>
         </w:rPr>
-        <w:t xml:space="preserve">Live portal screenshot</w:t>
+        <w:t xml:space="preserve">Illustrative sample — labels match the live portal; values do not.</w:t>
       </w:r>
     </w:p>
     <w:p>
@@ -3180,7 +3180,7 @@
       <w:r>
         <w:drawing>
           <wp:inline distT="0" distB="0" distL="0" distR="0">
-            <wp:extent cx="5905500" cy="19059525"/>
+            <wp:extent cx="4572000" cy="2428875"/>
             <wp:effectExtent t="0" r="0" b="0" l="0"/>
             <wp:docPr id="1" name="" descr="" title=""/>
             <wp:cNvGraphicFramePr>
@@ -3205,7 +3205,7 @@
                   <pic:spPr bwMode="auto">
                     <a:xfrm>
                       <a:off x="0" y="0"/>
-                      <a:ext cx="5905500" cy="19059525"/>
+                      <a:ext cx="4572000" cy="2428875"/>
                     </a:xfrm>
                     <a:prstGeom prst="rect">
                       <a:avLst/>
@@ -3231,7 +3231,7 @@
           <w:sz w:val="14"/>
           <w:szCs w:val="14"/>
         </w:rPr>
-        <w:t xml:space="preserve">Live portal screenshot</w:t>
+        <w:t xml:space="preserve">Illustrative sample — labels match the live portal; values do not.</w:t>
       </w:r>
     </w:p>
     <w:p>
@@ -3753,7 +3753,7 @@
       <w:r>
         <w:drawing>
           <wp:inline distT="0" distB="0" distL="0" distR="0">
-            <wp:extent cx="5905500" cy="21707475"/>
+            <wp:extent cx="4572000" cy="2162175"/>
             <wp:effectExtent t="0" r="0" b="0" l="0"/>
             <wp:docPr id="1" name="" descr="" title=""/>
             <wp:cNvGraphicFramePr>
@@ -3778,7 +3778,7 @@
                   <pic:spPr bwMode="auto">
                     <a:xfrm>
                       <a:off x="0" y="0"/>
-                      <a:ext cx="5905500" cy="21707475"/>
+                      <a:ext cx="4572000" cy="2162175"/>
                     </a:xfrm>
                     <a:prstGeom prst="rect">
                       <a:avLst/>
@@ -3804,7 +3804,7 @@
           <w:sz w:val="14"/>
           <w:szCs w:val="14"/>
         </w:rPr>
-        <w:t xml:space="preserve">Live portal screenshot</w:t>
+        <w:t xml:space="preserve">Illustrative sample — labels match the live portal; values do not.</w:t>
       </w:r>
     </w:p>
     <w:p>
@@ -4184,68 +4184,6 @@
     </w:p>
     <w:p>
       <w:pPr>
-        <w:spacing w:after="30" w:before="60"/>
-        <w:jc w:val="center"/>
-      </w:pPr>
-      <w:r>
-        <w:drawing>
-          <wp:inline distT="0" distB="0" distL="0" distR="0">
-            <wp:extent cx="5905500" cy="13125450"/>
-            <wp:effectExtent t="0" r="0" b="0" l="0"/>
-            <wp:docPr id="1" name="" descr="" title=""/>
-            <wp:cNvGraphicFramePr>
-              <a:graphicFrameLocks xmlns:a="http://schemas.openxmlformats.org/drawingml/2006/main" noChangeAspect="1"/>
-            </wp:cNvGraphicFramePr>
-            <a:graphic xmlns:a="http://schemas.openxmlformats.org/drawingml/2006/main">
-              <a:graphicData uri="http://schemas.openxmlformats.org/drawingml/2006/picture">
-                <pic:pic xmlns:pic="http://schemas.openxmlformats.org/drawingml/2006/picture">
-                  <pic:nvPicPr>
-                    <pic:cNvPr id="0" name="" descr=""/>
-                    <pic:cNvPicPr>
-                      <a:picLocks noChangeAspect="1" noChangeArrowheads="1"/>
-                    </pic:cNvPicPr>
-                  </pic:nvPicPr>
-                  <pic:blipFill>
-                    <a:blip r:embed="rId18" cstate="none"/>
-                    <a:srcRect/>
-                    <a:stretch>
-                      <a:fillRect/>
-                    </a:stretch>
-                  </pic:blipFill>
-                  <pic:spPr bwMode="auto">
-                    <a:xfrm>
-                      <a:off x="0" y="0"/>
-                      <a:ext cx="5905500" cy="13125450"/>
-                    </a:xfrm>
-                    <a:prstGeom prst="rect">
-                      <a:avLst/>
-                    </a:prstGeom>
-                  </pic:spPr>
-                </pic:pic>
-              </a:graphicData>
-            </a:graphic>
-          </wp:inline>
-        </w:drawing>
-      </w:r>
-    </w:p>
-    <w:p>
-      <w:pPr>
-        <w:spacing w:after="160"/>
-        <w:jc w:val="center"/>
-      </w:pPr>
-      <w:r>
-        <w:rPr>
-          <w:i/>
-          <w:iCs/>
-          <w:color w:val="6B6878"/>
-          <w:sz w:val="14"/>
-          <w:szCs w:val="14"/>
-        </w:rPr>
-        <w:t xml:space="preserve">Live portal screenshot</w:t>
-      </w:r>
-    </w:p>
-    <w:p>
-      <w:pPr>
         <w:pBdr>
           <w:bottom w:val="single" w:color="FFC72C" w:sz="8" w:space="2"/>
         </w:pBdr>
@@ -4417,68 +4355,6 @@
     </w:p>
     <w:p>
       <w:pPr>
-        <w:spacing w:after="30" w:before="60"/>
-        <w:jc w:val="center"/>
-      </w:pPr>
-      <w:r>
-        <w:drawing>
-          <wp:inline distT="0" distB="0" distL="0" distR="0">
-            <wp:extent cx="5905500" cy="13125450"/>
-            <wp:effectExtent t="0" r="0" b="0" l="0"/>
-            <wp:docPr id="1" name="" descr="" title=""/>
-            <wp:cNvGraphicFramePr>
-              <a:graphicFrameLocks xmlns:a="http://schemas.openxmlformats.org/drawingml/2006/main" noChangeAspect="1"/>
-            </wp:cNvGraphicFramePr>
-            <a:graphic xmlns:a="http://schemas.openxmlformats.org/drawingml/2006/main">
-              <a:graphicData uri="http://schemas.openxmlformats.org/drawingml/2006/picture">
-                <pic:pic xmlns:pic="http://schemas.openxmlformats.org/drawingml/2006/picture">
-                  <pic:nvPicPr>
-                    <pic:cNvPr id="0" name="" descr=""/>
-                    <pic:cNvPicPr>
-                      <a:picLocks noChangeAspect="1" noChangeArrowheads="1"/>
-                    </pic:cNvPicPr>
-                  </pic:nvPicPr>
-                  <pic:blipFill>
-                    <a:blip r:embed="rId19" cstate="none"/>
-                    <a:srcRect/>
-                    <a:stretch>
-                      <a:fillRect/>
-                    </a:stretch>
-                  </pic:blipFill>
-                  <pic:spPr bwMode="auto">
-                    <a:xfrm>
-                      <a:off x="0" y="0"/>
-                      <a:ext cx="5905500" cy="13125450"/>
-                    </a:xfrm>
-                    <a:prstGeom prst="rect">
-                      <a:avLst/>
-                    </a:prstGeom>
-                  </pic:spPr>
-                </pic:pic>
-              </a:graphicData>
-            </a:graphic>
-          </wp:inline>
-        </w:drawing>
-      </w:r>
-    </w:p>
-    <w:p>
-      <w:pPr>
-        <w:spacing w:after="160"/>
-        <w:jc w:val="center"/>
-      </w:pPr>
-      <w:r>
-        <w:rPr>
-          <w:i/>
-          <w:iCs/>
-          <w:color w:val="6B6878"/>
-          <w:sz w:val="14"/>
-          <w:szCs w:val="14"/>
-        </w:rPr>
-        <w:t xml:space="preserve">Live portal screenshot</w:t>
-      </w:r>
-    </w:p>
-    <w:p>
-      <w:pPr>
         <w:pBdr>
           <w:bottom w:val="single" w:color="FFC72C" w:sz="8" w:space="2"/>
         </w:pBdr>
@@ -4597,68 +4473,6 @@
           <w:szCs w:val="19"/>
         </w:rPr>
         <w:t xml:space="preserve">This page is a catalog of every downloadable Excel report, grouped by section (Turnover, Retention, Exit Interviews, etc.). Click any card to open that report's own page, where you pick a period and filters before downloading. This index page itself has no filters — it's just a directory.</w:t>
-      </w:r>
-    </w:p>
-    <w:p>
-      <w:pPr>
-        <w:spacing w:after="30" w:before="60"/>
-        <w:jc w:val="center"/>
-      </w:pPr>
-      <w:r>
-        <w:drawing>
-          <wp:inline distT="0" distB="0" distL="0" distR="0">
-            <wp:extent cx="5905500" cy="13125450"/>
-            <wp:effectExtent t="0" r="0" b="0" l="0"/>
-            <wp:docPr id="1" name="" descr="" title=""/>
-            <wp:cNvGraphicFramePr>
-              <a:graphicFrameLocks xmlns:a="http://schemas.openxmlformats.org/drawingml/2006/main" noChangeAspect="1"/>
-            </wp:cNvGraphicFramePr>
-            <a:graphic xmlns:a="http://schemas.openxmlformats.org/drawingml/2006/main">
-              <a:graphicData uri="http://schemas.openxmlformats.org/drawingml/2006/picture">
-                <pic:pic xmlns:pic="http://schemas.openxmlformats.org/drawingml/2006/picture">
-                  <pic:nvPicPr>
-                    <pic:cNvPr id="0" name="" descr=""/>
-                    <pic:cNvPicPr>
-                      <a:picLocks noChangeAspect="1" noChangeArrowheads="1"/>
-                    </pic:cNvPicPr>
-                  </pic:nvPicPr>
-                  <pic:blipFill>
-                    <a:blip r:embed="rId20" cstate="none"/>
-                    <a:srcRect/>
-                    <a:stretch>
-                      <a:fillRect/>
-                    </a:stretch>
-                  </pic:blipFill>
-                  <pic:spPr bwMode="auto">
-                    <a:xfrm>
-                      <a:off x="0" y="0"/>
-                      <a:ext cx="5905500" cy="13125450"/>
-                    </a:xfrm>
-                    <a:prstGeom prst="rect">
-                      <a:avLst/>
-                    </a:prstGeom>
-                  </pic:spPr>
-                </pic:pic>
-              </a:graphicData>
-            </a:graphic>
-          </wp:inline>
-        </w:drawing>
-      </w:r>
-    </w:p>
-    <w:p>
-      <w:pPr>
-        <w:spacing w:after="160"/>
-        <w:jc w:val="center"/>
-      </w:pPr>
-      <w:r>
-        <w:rPr>
-          <w:i/>
-          <w:iCs/>
-          <w:color w:val="6B6878"/>
-          <w:sz w:val="14"/>
-          <w:szCs w:val="14"/>
-        </w:rPr>
-        <w:t xml:space="preserve">Live portal screenshot</w:t>
       </w:r>
     </w:p>
     <w:p>

</xml_diff>